<commit_message>
Updated Day 3 documents
</commit_message>
<xml_diff>
--- a/StudyGuides/Day 3/01_KSPP_Kernel_Hardening.docx
+++ b/StudyGuides/Day 3/01_KSPP_Kernel_Hardening.docx
@@ -80,12 +80,6 @@
         <w:gridCol w:w="10080"/>
       </w:tblGrid>
       <w:tr>
-        <w:tblPrEx>
-          <w:tblCellMar>
-            <w:top w:w="0" w:type="dxa"/>
-            <w:bottom w:w="0" w:type="dxa"/>
-          </w:tblCellMar>
-        </w:tblPrEx>
         <w:tc>
           <w:tcPr>
             <w:tcW w:w="10080" w:type="dxa"/>
@@ -344,12 +338,6 @@
         <w:gridCol w:w="10080"/>
       </w:tblGrid>
       <w:tr>
-        <w:tblPrEx>
-          <w:tblCellMar>
-            <w:top w:w="0" w:type="dxa"/>
-            <w:bottom w:w="0" w:type="dxa"/>
-          </w:tblCellMar>
-        </w:tblPrEx>
         <w:tc>
           <w:tcPr>
             <w:tcW w:w="10080" w:type="dxa"/>
@@ -638,12 +626,6 @@
         <w:gridCol w:w="10080"/>
       </w:tblGrid>
       <w:tr>
-        <w:tblPrEx>
-          <w:tblCellMar>
-            <w:top w:w="0" w:type="dxa"/>
-            <w:bottom w:w="0" w:type="dxa"/>
-          </w:tblCellMar>
-        </w:tblPrEx>
         <w:tc>
           <w:tcPr>
             <w:tcW w:w="10080" w:type="dxa"/>
@@ -795,12 +777,6 @@
         <w:gridCol w:w="10080"/>
       </w:tblGrid>
       <w:tr>
-        <w:tblPrEx>
-          <w:tblCellMar>
-            <w:top w:w="0" w:type="dxa"/>
-            <w:bottom w:w="0" w:type="dxa"/>
-          </w:tblCellMar>
-        </w:tblPrEx>
         <w:tc>
           <w:tcPr>
             <w:tcW w:w="10080" w:type="dxa"/>
@@ -994,12 +970,6 @@
         <w:gridCol w:w="10080"/>
       </w:tblGrid>
       <w:tr>
-        <w:tblPrEx>
-          <w:tblCellMar>
-            <w:top w:w="0" w:type="dxa"/>
-            <w:bottom w:w="0" w:type="dxa"/>
-          </w:tblCellMar>
-        </w:tblPrEx>
         <w:tc>
           <w:tcPr>
             <w:tcW w:w="10080" w:type="dxa"/>
@@ -1050,12 +1020,6 @@
         </w:tc>
       </w:tr>
       <w:tr>
-        <w:tblPrEx>
-          <w:tblCellMar>
-            <w:top w:w="0" w:type="dxa"/>
-            <w:bottom w:w="0" w:type="dxa"/>
-          </w:tblCellMar>
-        </w:tblPrEx>
         <w:tc>
           <w:tcPr>
             <w:tcW w:w="10080" w:type="dxa"/>
@@ -1194,12 +1158,6 @@
         <w:gridCol w:w="10080"/>
       </w:tblGrid>
       <w:tr>
-        <w:tblPrEx>
-          <w:tblCellMar>
-            <w:top w:w="0" w:type="dxa"/>
-            <w:bottom w:w="0" w:type="dxa"/>
-          </w:tblCellMar>
-        </w:tblPrEx>
         <w:tc>
           <w:tcPr>
             <w:tcW w:w="10080" w:type="dxa"/>
@@ -1327,12 +1285,6 @@
         <w:gridCol w:w="10080"/>
       </w:tblGrid>
       <w:tr>
-        <w:tblPrEx>
-          <w:tblCellMar>
-            <w:top w:w="0" w:type="dxa"/>
-            <w:bottom w:w="0" w:type="dxa"/>
-          </w:tblCellMar>
-        </w:tblPrEx>
         <w:tc>
           <w:tcPr>
             <w:tcW w:w="10080" w:type="dxa"/>
@@ -1531,12 +1483,6 @@
         <w:gridCol w:w="10080"/>
       </w:tblGrid>
       <w:tr>
-        <w:tblPrEx>
-          <w:tblCellMar>
-            <w:top w:w="0" w:type="dxa"/>
-            <w:bottom w:w="0" w:type="dxa"/>
-          </w:tblCellMar>
-        </w:tblPrEx>
         <w:tc>
           <w:tcPr>
             <w:tcW w:w="10080" w:type="dxa"/>
@@ -1747,12 +1693,6 @@
         <w:gridCol w:w="10080"/>
       </w:tblGrid>
       <w:tr>
-        <w:tblPrEx>
-          <w:tblCellMar>
-            <w:top w:w="0" w:type="dxa"/>
-            <w:bottom w:w="0" w:type="dxa"/>
-          </w:tblCellMar>
-        </w:tblPrEx>
         <w:tc>
           <w:tcPr>
             <w:tcW w:w="10080" w:type="dxa"/>
@@ -1889,12 +1829,6 @@
         <w:gridCol w:w="10080"/>
       </w:tblGrid>
       <w:tr>
-        <w:tblPrEx>
-          <w:tblCellMar>
-            <w:top w:w="0" w:type="dxa"/>
-            <w:bottom w:w="0" w:type="dxa"/>
-          </w:tblCellMar>
-        </w:tblPrEx>
         <w:tc>
           <w:tcPr>
             <w:tcW w:w="10080" w:type="dxa"/>
@@ -2022,12 +1956,6 @@
         <w:gridCol w:w="10080"/>
       </w:tblGrid>
       <w:tr>
-        <w:tblPrEx>
-          <w:tblCellMar>
-            <w:top w:w="0" w:type="dxa"/>
-            <w:bottom w:w="0" w:type="dxa"/>
-          </w:tblCellMar>
-        </w:tblPrEx>
         <w:tc>
           <w:tcPr>
             <w:tcW w:w="10080" w:type="dxa"/>
@@ -2146,12 +2074,6 @@
         <w:gridCol w:w="10453"/>
       </w:tblGrid>
       <w:tr>
-        <w:tblPrEx>
-          <w:tblCellMar>
-            <w:top w:w="0" w:type="dxa"/>
-            <w:bottom w:w="0" w:type="dxa"/>
-          </w:tblCellMar>
-        </w:tblPrEx>
         <w:tc>
           <w:tcPr>
             <w:tcW w:w="10080" w:type="dxa"/>
@@ -2222,12 +2144,6 @@
               <w:gridCol w:w="10080"/>
             </w:tblGrid>
             <w:tr>
-              <w:tblPrEx>
-                <w:tblCellMar>
-                  <w:top w:w="0" w:type="dxa"/>
-                  <w:bottom w:w="0" w:type="dxa"/>
-                </w:tblCellMar>
-              </w:tblPrEx>
               <w:tc>
                 <w:tcPr>
                   <w:tcW w:w="10080" w:type="dxa"/>
@@ -2405,12 +2321,6 @@
               <w:gridCol w:w="10080"/>
             </w:tblGrid>
             <w:tr>
-              <w:tblPrEx>
-                <w:tblCellMar>
-                  <w:top w:w="0" w:type="dxa"/>
-                  <w:bottom w:w="0" w:type="dxa"/>
-                </w:tblCellMar>
-              </w:tblPrEx>
               <w:tc>
                 <w:tcPr>
                   <w:tcW w:w="10080" w:type="dxa"/>
@@ -2907,12 +2817,6 @@
               <w:gridCol w:w="10080"/>
             </w:tblGrid>
             <w:tr>
-              <w:tblPrEx>
-                <w:tblCellMar>
-                  <w:top w:w="0" w:type="dxa"/>
-                  <w:bottom w:w="0" w:type="dxa"/>
-                </w:tblCellMar>
-              </w:tblPrEx>
               <w:tc>
                 <w:tcPr>
                   <w:tcW w:w="10080" w:type="dxa"/>
@@ -3004,12 +2908,6 @@
         <w:gridCol w:w="10080"/>
       </w:tblGrid>
       <w:tr>
-        <w:tblPrEx>
-          <w:tblCellMar>
-            <w:top w:w="0" w:type="dxa"/>
-            <w:bottom w:w="0" w:type="dxa"/>
-          </w:tblCellMar>
-        </w:tblPrEx>
         <w:tc>
           <w:tcPr>
             <w:tcW w:w="10080" w:type="dxa"/>
@@ -3250,12 +3148,6 @@
         <w:gridCol w:w="10080"/>
       </w:tblGrid>
       <w:tr>
-        <w:tblPrEx>
-          <w:tblCellMar>
-            <w:top w:w="0" w:type="dxa"/>
-            <w:bottom w:w="0" w:type="dxa"/>
-          </w:tblCellMar>
-        </w:tblPrEx>
         <w:tc>
           <w:tcPr>
             <w:tcW w:w="10080" w:type="dxa"/>
@@ -3733,12 +3625,6 @@
         <w:gridCol w:w="10080"/>
       </w:tblGrid>
       <w:tr>
-        <w:tblPrEx>
-          <w:tblCellMar>
-            <w:top w:w="0" w:type="dxa"/>
-            <w:bottom w:w="0" w:type="dxa"/>
-          </w:tblCellMar>
-        </w:tblPrEx>
         <w:tc>
           <w:tcPr>
             <w:tcW w:w="10080" w:type="dxa"/>
@@ -3934,6 +3820,30 @@
         </w:rPr>
         <w:t xml:space="preserve"> Audit Checklist</w:t>
       </w:r>
+    </w:p>
+    <w:p>
+      <w:pPr>
+        <w:spacing w:before="240" w:after="100"/>
+        <w:rPr>
+          <w:b/>
+          <w:bCs/>
+          <w:color w:val="CC0066"/>
+          <w:sz w:val="24"/>
+          <w:szCs w:val="24"/>
+        </w:rPr>
+      </w:pPr>
+      <w:hyperlink r:id="rId8" w:history="1">
+        <w:r>
+          <w:rPr>
+            <w:rStyle w:val="Hyperlink"/>
+            <w:b/>
+            <w:bCs/>
+            <w:sz w:val="24"/>
+            <w:szCs w:val="24"/>
+          </w:rPr>
+          <w:t>GitHub - a13xp0p0v/kernel-hardening-checker: A tool for checking the security hardening options of the Linux kernel · GitHub</w:t>
+        </w:r>
+      </w:hyperlink>
     </w:p>
     <w:p>
       <w:pPr>
@@ -3971,12 +3881,6 @@
         <w:gridCol w:w="10080"/>
       </w:tblGrid>
       <w:tr>
-        <w:tblPrEx>
-          <w:tblCellMar>
-            <w:top w:w="0" w:type="dxa"/>
-            <w:bottom w:w="0" w:type="dxa"/>
-          </w:tblCellMar>
-        </w:tblPrEx>
         <w:tc>
           <w:tcPr>
             <w:tcW w:w="10080" w:type="dxa"/>
@@ -4290,12 +4194,6 @@
         </w:tc>
       </w:tr>
       <w:tr>
-        <w:tblPrEx>
-          <w:tblCellMar>
-            <w:top w:w="0" w:type="dxa"/>
-            <w:bottom w:w="0" w:type="dxa"/>
-          </w:tblCellMar>
-        </w:tblPrEx>
         <w:tc>
           <w:tcPr>
             <w:tcW w:w="10080" w:type="dxa"/>
@@ -4435,12 +4333,6 @@
         </w:tc>
       </w:tr>
       <w:tr>
-        <w:tblPrEx>
-          <w:tblCellMar>
-            <w:top w:w="0" w:type="dxa"/>
-            <w:bottom w:w="0" w:type="dxa"/>
-          </w:tblCellMar>
-        </w:tblPrEx>
         <w:tc>
           <w:tcPr>
             <w:tcW w:w="10080" w:type="dxa"/>
@@ -4600,6 +4492,7 @@
         <w:spacing w:after="60"/>
       </w:pPr>
       <w:r>
+        <w:lastRenderedPageBreak/>
         <w:t>KSPP recommended settings: kernsec.org/wiki/index.php/Kernel_Self_Protection_Project/Recommended_Settings</w:t>
       </w:r>
     </w:p>
@@ -4652,7 +4545,6 @@
         <w:spacing w:after="60"/>
       </w:pPr>
       <w:r>
-        <w:lastRenderedPageBreak/>
         <w:t>Linux kernel security documentation: kernel.org/doc/html/latest/security/</w:t>
       </w:r>
     </w:p>
@@ -4675,7 +4567,7 @@
       </w:r>
     </w:p>
     <w:sectPr>
-      <w:footerReference w:type="default" r:id="rId8"/>
+      <w:footerReference w:type="default" r:id="rId9"/>
       <w:pgSz w:w="12240" w:h="15840"/>
       <w:pgMar w:top="1080" w:right="1080" w:bottom="1080" w:left="1080" w:header="708" w:footer="708" w:gutter="0"/>
       <w:cols w:space="720"/>

</xml_diff>